<commit_message>
Plan de trabajo en pdf
</commit_message>
<xml_diff>
--- a/FGN106PlanDeFormacionJovenIinvestigador.docx
+++ b/FGN106PlanDeFormacionJovenIinvestigador.docx
@@ -1,6 +1,6 @@
 
 <file path=word/document.xml><?xml version="1.0" encoding="utf-8"?>
-<w:document xmlns:wpc="http://schemas.microsoft.com/office/word/2010/wordprocessingCanvas" xmlns:cx="http://schemas.microsoft.com/office/drawing/2014/chartex" xmlns:cx1="http://schemas.microsoft.com/office/drawing/2015/9/8/chartex" xmlns:cx2="http://schemas.microsoft.com/office/drawing/2015/10/21/chartex" xmlns:cx3="http://schemas.microsoft.com/office/drawing/2016/5/9/chartex" xmlns:cx4="http://schemas.microsoft.com/office/drawing/2016/5/10/chartex" xmlns:cx5="http://schemas.microsoft.com/office/drawing/2016/5/11/chartex" xmlns:cx6="http://schemas.microsoft.com/office/drawing/2016/5/12/chartex" xmlns:cx7="http://schemas.microsoft.com/office/drawing/2016/5/13/chartex" xmlns:cx8="http://schemas.microsoft.com/office/drawing/2016/5/14/chartex" xmlns:mc="http://schemas.openxmlformats.org/markup-compatibility/2006" xmlns:aink="http://schemas.microsoft.com/office/drawing/2016/ink" xmlns:am3d="http://schemas.microsoft.com/office/drawing/2017/model3d" xmlns:o="urn:schemas-microsoft-com:office:office" xmlns:oel="http://schemas.microsoft.com/office/2019/extlst" xmlns:r="http://schemas.openxmlformats.org/officeDocument/2006/relationships" xmlns:m="http://schemas.openxmlformats.org/officeDocument/2006/math" xmlns:v="urn:schemas-microsoft-com:vml" xmlns:wp14="http://schemas.microsoft.com/office/word/2010/wordprocessingDrawing" xmlns:wp="http://schemas.openxmlformats.org/drawingml/2006/wordprocessingDrawing" xmlns:w10="urn:schemas-microsoft-com:office:word" xmlns:w="http://schemas.openxmlformats.org/wordprocessingml/2006/main" xmlns:w14="http://schemas.microsoft.com/office/word/2010/wordml" xmlns:w15="http://schemas.microsoft.com/office/word/2012/wordml" xmlns:w16cex="http://schemas.microsoft.com/office/word/2018/wordml/cex" xmlns:w16cid="http://schemas.microsoft.com/office/word/2016/wordml/cid" xmlns:w16="http://schemas.microsoft.com/office/word/2018/wordml" xmlns:w16du="http://schemas.microsoft.com/office/word/2023/wordml/word16du" xmlns:w16sdtdh="http://schemas.microsoft.com/office/word/2020/wordml/sdtdatahash" xmlns:w16se="http://schemas.microsoft.com/office/word/2015/wordml/symex" xmlns:wpg="http://schemas.microsoft.com/office/word/2010/wordprocessingGroup" xmlns:wpi="http://schemas.microsoft.com/office/word/2010/wordprocessingInk" xmlns:wne="http://schemas.microsoft.com/office/word/2006/wordml" xmlns:wps="http://schemas.microsoft.com/office/word/2010/wordprocessingShape" mc:Ignorable="w14 w15 w16se w16cid w16 w16cex w16sdtdh w16du wp14">
+<w:document xmlns:wpc="http://schemas.microsoft.com/office/word/2010/wordprocessingCanvas" xmlns:cx="http://schemas.microsoft.com/office/drawing/2014/chartex" xmlns:cx1="http://schemas.microsoft.com/office/drawing/2015/9/8/chartex" xmlns:cx2="http://schemas.microsoft.com/office/drawing/2015/10/21/chartex" xmlns:cx3="http://schemas.microsoft.com/office/drawing/2016/5/9/chartex" xmlns:cx4="http://schemas.microsoft.com/office/drawing/2016/5/10/chartex" xmlns:cx5="http://schemas.microsoft.com/office/drawing/2016/5/11/chartex" xmlns:cx6="http://schemas.microsoft.com/office/drawing/2016/5/12/chartex" xmlns:cx7="http://schemas.microsoft.com/office/drawing/2016/5/13/chartex" xmlns:cx8="http://schemas.microsoft.com/office/drawing/2016/5/14/chartex" xmlns:mc="http://schemas.openxmlformats.org/markup-compatibility/2006" xmlns:aink="http://schemas.microsoft.com/office/drawing/2016/ink" xmlns:am3d="http://schemas.microsoft.com/office/drawing/2017/model3d" xmlns:o="urn:schemas-microsoft-com:office:office" xmlns:oel="http://schemas.microsoft.com/office/2019/extlst" xmlns:r="http://schemas.openxmlformats.org/officeDocument/2006/relationships" xmlns:m="http://schemas.openxmlformats.org/officeDocument/2006/math" xmlns:v="urn:schemas-microsoft-com:vml" xmlns:wp14="http://schemas.microsoft.com/office/word/2010/wordprocessingDrawing" xmlns:wp="http://schemas.openxmlformats.org/drawingml/2006/wordprocessingDrawing" xmlns:w10="urn:schemas-microsoft-com:office:word" xmlns:w="http://schemas.openxmlformats.org/wordprocessingml/2006/main" xmlns:w14="http://schemas.microsoft.com/office/word/2010/wordml" xmlns:w15="http://schemas.microsoft.com/office/word/2012/wordml" xmlns:w16cex="http://schemas.microsoft.com/office/word/2018/wordml/cex" xmlns:w16cid="http://schemas.microsoft.com/office/word/2016/wordml/cid" xmlns:w16="http://schemas.microsoft.com/office/word/2018/wordml" xmlns:w16du="http://schemas.microsoft.com/office/word/2023/wordml/word16du" xmlns:w16sdtdh="http://schemas.microsoft.com/office/word/2020/wordml/sdtdatahash" xmlns:w16sdtfl="http://schemas.microsoft.com/office/word/2024/wordml/sdtformatlock" xmlns:w16se="http://schemas.microsoft.com/office/word/2015/wordml/symex" xmlns:wpg="http://schemas.microsoft.com/office/word/2010/wordprocessingGroup" xmlns:wpi="http://schemas.microsoft.com/office/word/2010/wordprocessingInk" xmlns:wne="http://schemas.microsoft.com/office/word/2006/wordml" xmlns:wps="http://schemas.microsoft.com/office/word/2010/wordprocessingShape" mc:Ignorable="w14 w15 w16se w16cid w16 w16cex w16sdtdh w16sdtfl w16du wp14">
   <w:body>
     <w:p>
       <w:pPr>
@@ -4688,39 +4688,6 @@
         </w:rPr>
         <w:t>.</w:t>
       </w:r>
-    </w:p>
-    <w:p>
-      <w:pPr>
-        <w:spacing w:line="276" w:lineRule="auto"/>
-        <w:rPr>
-          <w:rFonts w:ascii="Arial" w:hAnsi="Arial" w:cs="Arial"/>
-          <w:sz w:val="22"/>
-          <w:szCs w:val="22"/>
-          <w:lang w:val="es-CO"/>
-        </w:rPr>
-      </w:pPr>
-    </w:p>
-    <w:p>
-      <w:pPr>
-        <w:spacing w:line="276" w:lineRule="auto"/>
-        <w:rPr>
-          <w:rFonts w:ascii="Arial" w:hAnsi="Arial" w:cs="Arial"/>
-          <w:sz w:val="22"/>
-          <w:szCs w:val="22"/>
-          <w:lang w:val="es-CO"/>
-        </w:rPr>
-      </w:pPr>
-    </w:p>
-    <w:p>
-      <w:pPr>
-        <w:spacing w:line="276" w:lineRule="auto"/>
-        <w:rPr>
-          <w:rFonts w:ascii="Arial" w:hAnsi="Arial" w:cs="Arial"/>
-          <w:sz w:val="22"/>
-          <w:szCs w:val="22"/>
-          <w:lang w:val="es-CO"/>
-        </w:rPr>
-      </w:pPr>
     </w:p>
     <w:p>
       <w:pPr>
@@ -4999,18 +4966,57 @@
           <w:lang w:val="es-CO"/>
         </w:rPr>
       </w:pPr>
-    </w:p>
-    <w:p>
-      <w:pPr>
-        <w:spacing w:line="276" w:lineRule="auto"/>
+      <w:r>
         <w:rPr>
           <w:rFonts w:ascii="Arial" w:hAnsi="Arial" w:cs="Arial"/>
           <w:bCs/>
+          <w:noProof/>
           <w:sz w:val="22"/>
           <w:szCs w:val="22"/>
           <w:lang w:val="es-CO"/>
         </w:rPr>
-      </w:pPr>
+        <w:drawing>
+          <wp:inline distT="0" distB="0" distL="0" distR="0" wp14:anchorId="0D3B9CDD" wp14:editId="16D8430D">
+            <wp:extent cx="1465918" cy="424069"/>
+            <wp:effectExtent l="0" t="0" r="0" b="0"/>
+            <wp:docPr id="1434579622" name="Imagen 1"/>
+            <wp:cNvGraphicFramePr>
+              <a:graphicFrameLocks xmlns:a="http://schemas.openxmlformats.org/drawingml/2006/main" noChangeAspect="1"/>
+            </wp:cNvGraphicFramePr>
+            <a:graphic xmlns:a="http://schemas.openxmlformats.org/drawingml/2006/main">
+              <a:graphicData uri="http://schemas.openxmlformats.org/drawingml/2006/picture">
+                <pic:pic xmlns:pic="http://schemas.openxmlformats.org/drawingml/2006/picture">
+                  <pic:nvPicPr>
+                    <pic:cNvPr id="1434579622" name="Imagen 1434579622"/>
+                    <pic:cNvPicPr/>
+                  </pic:nvPicPr>
+                  <pic:blipFill>
+                    <a:blip r:embed="rId13" cstate="print">
+                      <a:extLst>
+                        <a:ext uri="{28A0092B-C50C-407E-A947-70E740481C1C}">
+                          <a14:useLocalDpi xmlns:a14="http://schemas.microsoft.com/office/drawing/2010/main" val="0"/>
+                        </a:ext>
+                      </a:extLst>
+                    </a:blip>
+                    <a:stretch>
+                      <a:fillRect/>
+                    </a:stretch>
+                  </pic:blipFill>
+                  <pic:spPr>
+                    <a:xfrm>
+                      <a:off x="0" y="0"/>
+                      <a:ext cx="1523780" cy="440808"/>
+                    </a:xfrm>
+                    <a:prstGeom prst="rect">
+                      <a:avLst/>
+                    </a:prstGeom>
+                  </pic:spPr>
+                </pic:pic>
+              </a:graphicData>
+            </a:graphic>
+          </wp:inline>
+        </w:drawing>
+      </w:r>
     </w:p>
     <w:tbl>
       <w:tblPr>
@@ -5165,9 +5171,9 @@
       </w:pPr>
     </w:p>
     <w:sectPr>
-      <w:headerReference w:type="default" r:id="rId13"/>
-      <w:headerReference w:type="first" r:id="rId14"/>
-      <w:footerReference w:type="first" r:id="rId15"/>
+      <w:headerReference w:type="default" r:id="rId14"/>
+      <w:headerReference w:type="first" r:id="rId15"/>
+      <w:footerReference w:type="first" r:id="rId16"/>
       <w:pgSz w:w="12240" w:h="15840" w:code="1"/>
       <w:pgMar w:top="1417" w:right="1701" w:bottom="1417" w:left="1701" w:header="720" w:footer="439" w:gutter="0"/>
       <w:cols w:space="720"/>
@@ -5178,7 +5184,7 @@
 </file>
 
 <file path=word/endnotes.xml><?xml version="1.0" encoding="utf-8"?>
-<w:endnotes xmlns:wpc="http://schemas.microsoft.com/office/word/2010/wordprocessingCanvas" xmlns:cx="http://schemas.microsoft.com/office/drawing/2014/chartex" xmlns:cx1="http://schemas.microsoft.com/office/drawing/2015/9/8/chartex" xmlns:cx2="http://schemas.microsoft.com/office/drawing/2015/10/21/chartex" xmlns:cx3="http://schemas.microsoft.com/office/drawing/2016/5/9/chartex" xmlns:cx4="http://schemas.microsoft.com/office/drawing/2016/5/10/chartex" xmlns:cx5="http://schemas.microsoft.com/office/drawing/2016/5/11/chartex" xmlns:cx6="http://schemas.microsoft.com/office/drawing/2016/5/12/chartex" xmlns:cx7="http://schemas.microsoft.com/office/drawing/2016/5/13/chartex" xmlns:cx8="http://schemas.microsoft.com/office/drawing/2016/5/14/chartex" xmlns:mc="http://schemas.openxmlformats.org/markup-compatibility/2006" xmlns:aink="http://schemas.microsoft.com/office/drawing/2016/ink" xmlns:am3d="http://schemas.microsoft.com/office/drawing/2017/model3d" xmlns:o="urn:schemas-microsoft-com:office:office" xmlns:oel="http://schemas.microsoft.com/office/2019/extlst" xmlns:r="http://schemas.openxmlformats.org/officeDocument/2006/relationships" xmlns:m="http://schemas.openxmlformats.org/officeDocument/2006/math" xmlns:v="urn:schemas-microsoft-com:vml" xmlns:wp14="http://schemas.microsoft.com/office/word/2010/wordprocessingDrawing" xmlns:wp="http://schemas.openxmlformats.org/drawingml/2006/wordprocessingDrawing" xmlns:w10="urn:schemas-microsoft-com:office:word" xmlns:w="http://schemas.openxmlformats.org/wordprocessingml/2006/main" xmlns:w14="http://schemas.microsoft.com/office/word/2010/wordml" xmlns:w15="http://schemas.microsoft.com/office/word/2012/wordml" xmlns:w16cex="http://schemas.microsoft.com/office/word/2018/wordml/cex" xmlns:w16cid="http://schemas.microsoft.com/office/word/2016/wordml/cid" xmlns:w16="http://schemas.microsoft.com/office/word/2018/wordml" xmlns:w16du="http://schemas.microsoft.com/office/word/2023/wordml/word16du" xmlns:w16sdtdh="http://schemas.microsoft.com/office/word/2020/wordml/sdtdatahash" xmlns:w16se="http://schemas.microsoft.com/office/word/2015/wordml/symex" xmlns:wpg="http://schemas.microsoft.com/office/word/2010/wordprocessingGroup" xmlns:wpi="http://schemas.microsoft.com/office/word/2010/wordprocessingInk" xmlns:wne="http://schemas.microsoft.com/office/word/2006/wordml" xmlns:wps="http://schemas.microsoft.com/office/word/2010/wordprocessingShape" mc:Ignorable="w14 w15 w16se w16cid w16 w16cex w16sdtdh w16du wp14">
+<w:endnotes xmlns:wpc="http://schemas.microsoft.com/office/word/2010/wordprocessingCanvas" xmlns:cx="http://schemas.microsoft.com/office/drawing/2014/chartex" xmlns:cx1="http://schemas.microsoft.com/office/drawing/2015/9/8/chartex" xmlns:cx2="http://schemas.microsoft.com/office/drawing/2015/10/21/chartex" xmlns:cx3="http://schemas.microsoft.com/office/drawing/2016/5/9/chartex" xmlns:cx4="http://schemas.microsoft.com/office/drawing/2016/5/10/chartex" xmlns:cx5="http://schemas.microsoft.com/office/drawing/2016/5/11/chartex" xmlns:cx6="http://schemas.microsoft.com/office/drawing/2016/5/12/chartex" xmlns:cx7="http://schemas.microsoft.com/office/drawing/2016/5/13/chartex" xmlns:cx8="http://schemas.microsoft.com/office/drawing/2016/5/14/chartex" xmlns:mc="http://schemas.openxmlformats.org/markup-compatibility/2006" xmlns:aink="http://schemas.microsoft.com/office/drawing/2016/ink" xmlns:am3d="http://schemas.microsoft.com/office/drawing/2017/model3d" xmlns:o="urn:schemas-microsoft-com:office:office" xmlns:oel="http://schemas.microsoft.com/office/2019/extlst" xmlns:r="http://schemas.openxmlformats.org/officeDocument/2006/relationships" xmlns:m="http://schemas.openxmlformats.org/officeDocument/2006/math" xmlns:v="urn:schemas-microsoft-com:vml" xmlns:wp14="http://schemas.microsoft.com/office/word/2010/wordprocessingDrawing" xmlns:wp="http://schemas.openxmlformats.org/drawingml/2006/wordprocessingDrawing" xmlns:w10="urn:schemas-microsoft-com:office:word" xmlns:w="http://schemas.openxmlformats.org/wordprocessingml/2006/main" xmlns:w14="http://schemas.microsoft.com/office/word/2010/wordml" xmlns:w15="http://schemas.microsoft.com/office/word/2012/wordml" xmlns:w16cex="http://schemas.microsoft.com/office/word/2018/wordml/cex" xmlns:w16cid="http://schemas.microsoft.com/office/word/2016/wordml/cid" xmlns:w16="http://schemas.microsoft.com/office/word/2018/wordml" xmlns:w16du="http://schemas.microsoft.com/office/word/2023/wordml/word16du" xmlns:w16sdtdh="http://schemas.microsoft.com/office/word/2020/wordml/sdtdatahash" xmlns:w16sdtfl="http://schemas.microsoft.com/office/word/2024/wordml/sdtformatlock" xmlns:w16se="http://schemas.microsoft.com/office/word/2015/wordml/symex" xmlns:wpg="http://schemas.microsoft.com/office/word/2010/wordprocessingGroup" xmlns:wpi="http://schemas.microsoft.com/office/word/2010/wordprocessingInk" xmlns:wne="http://schemas.microsoft.com/office/word/2006/wordml" xmlns:wps="http://schemas.microsoft.com/office/word/2010/wordprocessingShape" mc:Ignorable="w14 w15 w16se w16cid w16 w16cex w16sdtdh w16sdtfl w16du wp14">
   <w:endnote w:type="separator" w:id="-1">
     <w:p>
       <w:r>
@@ -5197,7 +5203,7 @@
 </file>
 
 <file path=word/footer1.xml><?xml version="1.0" encoding="utf-8"?>
-<w:ftr xmlns:wpc="http://schemas.microsoft.com/office/word/2010/wordprocessingCanvas" xmlns:cx="http://schemas.microsoft.com/office/drawing/2014/chartex" xmlns:cx1="http://schemas.microsoft.com/office/drawing/2015/9/8/chartex" xmlns:cx2="http://schemas.microsoft.com/office/drawing/2015/10/21/chartex" xmlns:cx3="http://schemas.microsoft.com/office/drawing/2016/5/9/chartex" xmlns:cx4="http://schemas.microsoft.com/office/drawing/2016/5/10/chartex" xmlns:cx5="http://schemas.microsoft.com/office/drawing/2016/5/11/chartex" xmlns:cx6="http://schemas.microsoft.com/office/drawing/2016/5/12/chartex" xmlns:cx7="http://schemas.microsoft.com/office/drawing/2016/5/13/chartex" xmlns:cx8="http://schemas.microsoft.com/office/drawing/2016/5/14/chartex" xmlns:mc="http://schemas.openxmlformats.org/markup-compatibility/2006" xmlns:aink="http://schemas.microsoft.com/office/drawing/2016/ink" xmlns:am3d="http://schemas.microsoft.com/office/drawing/2017/model3d" xmlns:o="urn:schemas-microsoft-com:office:office" xmlns:oel="http://schemas.microsoft.com/office/2019/extlst" xmlns:r="http://schemas.openxmlformats.org/officeDocument/2006/relationships" xmlns:m="http://schemas.openxmlformats.org/officeDocument/2006/math" xmlns:v="urn:schemas-microsoft-com:vml" xmlns:wp14="http://schemas.microsoft.com/office/word/2010/wordprocessingDrawing" xmlns:wp="http://schemas.openxmlformats.org/drawingml/2006/wordprocessingDrawing" xmlns:w10="urn:schemas-microsoft-com:office:word" xmlns:w="http://schemas.openxmlformats.org/wordprocessingml/2006/main" xmlns:w14="http://schemas.microsoft.com/office/word/2010/wordml" xmlns:w15="http://schemas.microsoft.com/office/word/2012/wordml" xmlns:w16cex="http://schemas.microsoft.com/office/word/2018/wordml/cex" xmlns:w16cid="http://schemas.microsoft.com/office/word/2016/wordml/cid" xmlns:w16="http://schemas.microsoft.com/office/word/2018/wordml" xmlns:w16du="http://schemas.microsoft.com/office/word/2023/wordml/word16du" xmlns:w16sdtdh="http://schemas.microsoft.com/office/word/2020/wordml/sdtdatahash" xmlns:w16se="http://schemas.microsoft.com/office/word/2015/wordml/symex" xmlns:wpg="http://schemas.microsoft.com/office/word/2010/wordprocessingGroup" xmlns:wpi="http://schemas.microsoft.com/office/word/2010/wordprocessingInk" xmlns:wne="http://schemas.microsoft.com/office/word/2006/wordml" xmlns:wps="http://schemas.microsoft.com/office/word/2010/wordprocessingShape" mc:Ignorable="w14 w15 w16se w16cid w16 w16cex w16sdtdh w16du wp14">
+<w:ftr xmlns:wpc="http://schemas.microsoft.com/office/word/2010/wordprocessingCanvas" xmlns:cx="http://schemas.microsoft.com/office/drawing/2014/chartex" xmlns:cx1="http://schemas.microsoft.com/office/drawing/2015/9/8/chartex" xmlns:cx2="http://schemas.microsoft.com/office/drawing/2015/10/21/chartex" xmlns:cx3="http://schemas.microsoft.com/office/drawing/2016/5/9/chartex" xmlns:cx4="http://schemas.microsoft.com/office/drawing/2016/5/10/chartex" xmlns:cx5="http://schemas.microsoft.com/office/drawing/2016/5/11/chartex" xmlns:cx6="http://schemas.microsoft.com/office/drawing/2016/5/12/chartex" xmlns:cx7="http://schemas.microsoft.com/office/drawing/2016/5/13/chartex" xmlns:cx8="http://schemas.microsoft.com/office/drawing/2016/5/14/chartex" xmlns:mc="http://schemas.openxmlformats.org/markup-compatibility/2006" xmlns:aink="http://schemas.microsoft.com/office/drawing/2016/ink" xmlns:am3d="http://schemas.microsoft.com/office/drawing/2017/model3d" xmlns:o="urn:schemas-microsoft-com:office:office" xmlns:oel="http://schemas.microsoft.com/office/2019/extlst" xmlns:r="http://schemas.openxmlformats.org/officeDocument/2006/relationships" xmlns:m="http://schemas.openxmlformats.org/officeDocument/2006/math" xmlns:v="urn:schemas-microsoft-com:vml" xmlns:wp14="http://schemas.microsoft.com/office/word/2010/wordprocessingDrawing" xmlns:wp="http://schemas.openxmlformats.org/drawingml/2006/wordprocessingDrawing" xmlns:w10="urn:schemas-microsoft-com:office:word" xmlns:w="http://schemas.openxmlformats.org/wordprocessingml/2006/main" xmlns:w14="http://schemas.microsoft.com/office/word/2010/wordml" xmlns:w15="http://schemas.microsoft.com/office/word/2012/wordml" xmlns:w16cex="http://schemas.microsoft.com/office/word/2018/wordml/cex" xmlns:w16cid="http://schemas.microsoft.com/office/word/2016/wordml/cid" xmlns:w16="http://schemas.microsoft.com/office/word/2018/wordml" xmlns:w16du="http://schemas.microsoft.com/office/word/2023/wordml/word16du" xmlns:w16sdtdh="http://schemas.microsoft.com/office/word/2020/wordml/sdtdatahash" xmlns:w16sdtfl="http://schemas.microsoft.com/office/word/2024/wordml/sdtformatlock" xmlns:w16se="http://schemas.microsoft.com/office/word/2015/wordml/symex" xmlns:wpg="http://schemas.microsoft.com/office/word/2010/wordprocessingGroup" xmlns:wpi="http://schemas.microsoft.com/office/word/2010/wordprocessingInk" xmlns:wne="http://schemas.microsoft.com/office/word/2006/wordml" xmlns:wps="http://schemas.microsoft.com/office/word/2010/wordprocessingShape" mc:Ignorable="w14 w15 w16se w16cid w16 w16cex w16sdtdh w16sdtfl w16du wp14">
   <w:p>
     <w:pPr>
       <w:pStyle w:val="Piedepgina"/>
@@ -5242,7 +5248,7 @@
 </file>
 
 <file path=word/footnotes.xml><?xml version="1.0" encoding="utf-8"?>
-<w:footnotes xmlns:wpc="http://schemas.microsoft.com/office/word/2010/wordprocessingCanvas" xmlns:cx="http://schemas.microsoft.com/office/drawing/2014/chartex" xmlns:cx1="http://schemas.microsoft.com/office/drawing/2015/9/8/chartex" xmlns:cx2="http://schemas.microsoft.com/office/drawing/2015/10/21/chartex" xmlns:cx3="http://schemas.microsoft.com/office/drawing/2016/5/9/chartex" xmlns:cx4="http://schemas.microsoft.com/office/drawing/2016/5/10/chartex" xmlns:cx5="http://schemas.microsoft.com/office/drawing/2016/5/11/chartex" xmlns:cx6="http://schemas.microsoft.com/office/drawing/2016/5/12/chartex" xmlns:cx7="http://schemas.microsoft.com/office/drawing/2016/5/13/chartex" xmlns:cx8="http://schemas.microsoft.com/office/drawing/2016/5/14/chartex" xmlns:mc="http://schemas.openxmlformats.org/markup-compatibility/2006" xmlns:aink="http://schemas.microsoft.com/office/drawing/2016/ink" xmlns:am3d="http://schemas.microsoft.com/office/drawing/2017/model3d" xmlns:o="urn:schemas-microsoft-com:office:office" xmlns:oel="http://schemas.microsoft.com/office/2019/extlst" xmlns:r="http://schemas.openxmlformats.org/officeDocument/2006/relationships" xmlns:m="http://schemas.openxmlformats.org/officeDocument/2006/math" xmlns:v="urn:schemas-microsoft-com:vml" xmlns:wp14="http://schemas.microsoft.com/office/word/2010/wordprocessingDrawing" xmlns:wp="http://schemas.openxmlformats.org/drawingml/2006/wordprocessingDrawing" xmlns:w10="urn:schemas-microsoft-com:office:word" xmlns:w="http://schemas.openxmlformats.org/wordprocessingml/2006/main" xmlns:w14="http://schemas.microsoft.com/office/word/2010/wordml" xmlns:w15="http://schemas.microsoft.com/office/word/2012/wordml" xmlns:w16cex="http://schemas.microsoft.com/office/word/2018/wordml/cex" xmlns:w16cid="http://schemas.microsoft.com/office/word/2016/wordml/cid" xmlns:w16="http://schemas.microsoft.com/office/word/2018/wordml" xmlns:w16du="http://schemas.microsoft.com/office/word/2023/wordml/word16du" xmlns:w16sdtdh="http://schemas.microsoft.com/office/word/2020/wordml/sdtdatahash" xmlns:w16se="http://schemas.microsoft.com/office/word/2015/wordml/symex" xmlns:wpg="http://schemas.microsoft.com/office/word/2010/wordprocessingGroup" xmlns:wpi="http://schemas.microsoft.com/office/word/2010/wordprocessingInk" xmlns:wne="http://schemas.microsoft.com/office/word/2006/wordml" xmlns:wps="http://schemas.microsoft.com/office/word/2010/wordprocessingShape" mc:Ignorable="w14 w15 w16se w16cid w16 w16cex w16sdtdh w16du wp14">
+<w:footnotes xmlns:wpc="http://schemas.microsoft.com/office/word/2010/wordprocessingCanvas" xmlns:cx="http://schemas.microsoft.com/office/drawing/2014/chartex" xmlns:cx1="http://schemas.microsoft.com/office/drawing/2015/9/8/chartex" xmlns:cx2="http://schemas.microsoft.com/office/drawing/2015/10/21/chartex" xmlns:cx3="http://schemas.microsoft.com/office/drawing/2016/5/9/chartex" xmlns:cx4="http://schemas.microsoft.com/office/drawing/2016/5/10/chartex" xmlns:cx5="http://schemas.microsoft.com/office/drawing/2016/5/11/chartex" xmlns:cx6="http://schemas.microsoft.com/office/drawing/2016/5/12/chartex" xmlns:cx7="http://schemas.microsoft.com/office/drawing/2016/5/13/chartex" xmlns:cx8="http://schemas.microsoft.com/office/drawing/2016/5/14/chartex" xmlns:mc="http://schemas.openxmlformats.org/markup-compatibility/2006" xmlns:aink="http://schemas.microsoft.com/office/drawing/2016/ink" xmlns:am3d="http://schemas.microsoft.com/office/drawing/2017/model3d" xmlns:o="urn:schemas-microsoft-com:office:office" xmlns:oel="http://schemas.microsoft.com/office/2019/extlst" xmlns:r="http://schemas.openxmlformats.org/officeDocument/2006/relationships" xmlns:m="http://schemas.openxmlformats.org/officeDocument/2006/math" xmlns:v="urn:schemas-microsoft-com:vml" xmlns:wp14="http://schemas.microsoft.com/office/word/2010/wordprocessingDrawing" xmlns:wp="http://schemas.openxmlformats.org/drawingml/2006/wordprocessingDrawing" xmlns:w10="urn:schemas-microsoft-com:office:word" xmlns:w="http://schemas.openxmlformats.org/wordprocessingml/2006/main" xmlns:w14="http://schemas.microsoft.com/office/word/2010/wordml" xmlns:w15="http://schemas.microsoft.com/office/word/2012/wordml" xmlns:w16cex="http://schemas.microsoft.com/office/word/2018/wordml/cex" xmlns:w16cid="http://schemas.microsoft.com/office/word/2016/wordml/cid" xmlns:w16="http://schemas.microsoft.com/office/word/2018/wordml" xmlns:w16du="http://schemas.microsoft.com/office/word/2023/wordml/word16du" xmlns:w16sdtdh="http://schemas.microsoft.com/office/word/2020/wordml/sdtdatahash" xmlns:w16sdtfl="http://schemas.microsoft.com/office/word/2024/wordml/sdtformatlock" xmlns:w16se="http://schemas.microsoft.com/office/word/2015/wordml/symex" xmlns:wpg="http://schemas.microsoft.com/office/word/2010/wordprocessingGroup" xmlns:wpi="http://schemas.microsoft.com/office/word/2010/wordprocessingInk" xmlns:wne="http://schemas.microsoft.com/office/word/2006/wordml" xmlns:wps="http://schemas.microsoft.com/office/word/2010/wordprocessingShape" mc:Ignorable="w14 w15 w16se w16cid w16 w16cex w16sdtdh w16sdtfl w16du wp14">
   <w:footnote w:type="separator" w:id="-1">
     <w:p>
       <w:r>
@@ -5261,7 +5267,7 @@
 </file>
 
 <file path=word/header1.xml><?xml version="1.0" encoding="utf-8"?>
-<w:hdr xmlns:wpc="http://schemas.microsoft.com/office/word/2010/wordprocessingCanvas" xmlns:cx="http://schemas.microsoft.com/office/drawing/2014/chartex" xmlns:cx1="http://schemas.microsoft.com/office/drawing/2015/9/8/chartex" xmlns:cx2="http://schemas.microsoft.com/office/drawing/2015/10/21/chartex" xmlns:cx3="http://schemas.microsoft.com/office/drawing/2016/5/9/chartex" xmlns:cx4="http://schemas.microsoft.com/office/drawing/2016/5/10/chartex" xmlns:cx5="http://schemas.microsoft.com/office/drawing/2016/5/11/chartex" xmlns:cx6="http://schemas.microsoft.com/office/drawing/2016/5/12/chartex" xmlns:cx7="http://schemas.microsoft.com/office/drawing/2016/5/13/chartex" xmlns:cx8="http://schemas.microsoft.com/office/drawing/2016/5/14/chartex" xmlns:mc="http://schemas.openxmlformats.org/markup-compatibility/2006" xmlns:aink="http://schemas.microsoft.com/office/drawing/2016/ink" xmlns:am3d="http://schemas.microsoft.com/office/drawing/2017/model3d" xmlns:o="urn:schemas-microsoft-com:office:office" xmlns:oel="http://schemas.microsoft.com/office/2019/extlst" xmlns:r="http://schemas.openxmlformats.org/officeDocument/2006/relationships" xmlns:m="http://schemas.openxmlformats.org/officeDocument/2006/math" xmlns:v="urn:schemas-microsoft-com:vml" xmlns:wp14="http://schemas.microsoft.com/office/word/2010/wordprocessingDrawing" xmlns:wp="http://schemas.openxmlformats.org/drawingml/2006/wordprocessingDrawing" xmlns:w10="urn:schemas-microsoft-com:office:word" xmlns:w="http://schemas.openxmlformats.org/wordprocessingml/2006/main" xmlns:w14="http://schemas.microsoft.com/office/word/2010/wordml" xmlns:w15="http://schemas.microsoft.com/office/word/2012/wordml" xmlns:w16cex="http://schemas.microsoft.com/office/word/2018/wordml/cex" xmlns:w16cid="http://schemas.microsoft.com/office/word/2016/wordml/cid" xmlns:w16="http://schemas.microsoft.com/office/word/2018/wordml" xmlns:w16du="http://schemas.microsoft.com/office/word/2023/wordml/word16du" xmlns:w16sdtdh="http://schemas.microsoft.com/office/word/2020/wordml/sdtdatahash" xmlns:w16se="http://schemas.microsoft.com/office/word/2015/wordml/symex" xmlns:wpg="http://schemas.microsoft.com/office/word/2010/wordprocessingGroup" xmlns:wpi="http://schemas.microsoft.com/office/word/2010/wordprocessingInk" xmlns:wne="http://schemas.microsoft.com/office/word/2006/wordml" xmlns:wps="http://schemas.microsoft.com/office/word/2010/wordprocessingShape" mc:Ignorable="w14 w15 w16se w16cid w16 w16cex w16sdtdh w16du wp14">
+<w:hdr xmlns:wpc="http://schemas.microsoft.com/office/word/2010/wordprocessingCanvas" xmlns:cx="http://schemas.microsoft.com/office/drawing/2014/chartex" xmlns:cx1="http://schemas.microsoft.com/office/drawing/2015/9/8/chartex" xmlns:cx2="http://schemas.microsoft.com/office/drawing/2015/10/21/chartex" xmlns:cx3="http://schemas.microsoft.com/office/drawing/2016/5/9/chartex" xmlns:cx4="http://schemas.microsoft.com/office/drawing/2016/5/10/chartex" xmlns:cx5="http://schemas.microsoft.com/office/drawing/2016/5/11/chartex" xmlns:cx6="http://schemas.microsoft.com/office/drawing/2016/5/12/chartex" xmlns:cx7="http://schemas.microsoft.com/office/drawing/2016/5/13/chartex" xmlns:cx8="http://schemas.microsoft.com/office/drawing/2016/5/14/chartex" xmlns:mc="http://schemas.openxmlformats.org/markup-compatibility/2006" xmlns:aink="http://schemas.microsoft.com/office/drawing/2016/ink" xmlns:am3d="http://schemas.microsoft.com/office/drawing/2017/model3d" xmlns:o="urn:schemas-microsoft-com:office:office" xmlns:oel="http://schemas.microsoft.com/office/2019/extlst" xmlns:r="http://schemas.openxmlformats.org/officeDocument/2006/relationships" xmlns:m="http://schemas.openxmlformats.org/officeDocument/2006/math" xmlns:v="urn:schemas-microsoft-com:vml" xmlns:wp14="http://schemas.microsoft.com/office/word/2010/wordprocessingDrawing" xmlns:wp="http://schemas.openxmlformats.org/drawingml/2006/wordprocessingDrawing" xmlns:w10="urn:schemas-microsoft-com:office:word" xmlns:w="http://schemas.openxmlformats.org/wordprocessingml/2006/main" xmlns:w14="http://schemas.microsoft.com/office/word/2010/wordml" xmlns:w15="http://schemas.microsoft.com/office/word/2012/wordml" xmlns:w16cex="http://schemas.microsoft.com/office/word/2018/wordml/cex" xmlns:w16cid="http://schemas.microsoft.com/office/word/2016/wordml/cid" xmlns:w16="http://schemas.microsoft.com/office/word/2018/wordml" xmlns:w16du="http://schemas.microsoft.com/office/word/2023/wordml/word16du" xmlns:w16sdtdh="http://schemas.microsoft.com/office/word/2020/wordml/sdtdatahash" xmlns:w16sdtfl="http://schemas.microsoft.com/office/word/2024/wordml/sdtformatlock" xmlns:w16se="http://schemas.microsoft.com/office/word/2015/wordml/symex" xmlns:wpg="http://schemas.microsoft.com/office/word/2010/wordprocessingGroup" xmlns:wpi="http://schemas.microsoft.com/office/word/2010/wordprocessingInk" xmlns:wne="http://schemas.microsoft.com/office/word/2006/wordml" xmlns:wps="http://schemas.microsoft.com/office/word/2010/wordprocessingShape" mc:Ignorable="w14 w15 w16se w16cid w16 w16cex w16sdtdh w16sdtfl w16du wp14">
   <w:tbl>
     <w:tblPr>
       <w:tblW w:w="10207" w:type="dxa"/>
@@ -5594,7 +5600,7 @@
 </file>
 
 <file path=word/header2.xml><?xml version="1.0" encoding="utf-8"?>
-<w:hdr xmlns:wpc="http://schemas.microsoft.com/office/word/2010/wordprocessingCanvas" xmlns:cx="http://schemas.microsoft.com/office/drawing/2014/chartex" xmlns:cx1="http://schemas.microsoft.com/office/drawing/2015/9/8/chartex" xmlns:cx2="http://schemas.microsoft.com/office/drawing/2015/10/21/chartex" xmlns:cx3="http://schemas.microsoft.com/office/drawing/2016/5/9/chartex" xmlns:cx4="http://schemas.microsoft.com/office/drawing/2016/5/10/chartex" xmlns:cx5="http://schemas.microsoft.com/office/drawing/2016/5/11/chartex" xmlns:cx6="http://schemas.microsoft.com/office/drawing/2016/5/12/chartex" xmlns:cx7="http://schemas.microsoft.com/office/drawing/2016/5/13/chartex" xmlns:cx8="http://schemas.microsoft.com/office/drawing/2016/5/14/chartex" xmlns:mc="http://schemas.openxmlformats.org/markup-compatibility/2006" xmlns:aink="http://schemas.microsoft.com/office/drawing/2016/ink" xmlns:am3d="http://schemas.microsoft.com/office/drawing/2017/model3d" xmlns:o="urn:schemas-microsoft-com:office:office" xmlns:oel="http://schemas.microsoft.com/office/2019/extlst" xmlns:r="http://schemas.openxmlformats.org/officeDocument/2006/relationships" xmlns:m="http://schemas.openxmlformats.org/officeDocument/2006/math" xmlns:v="urn:schemas-microsoft-com:vml" xmlns:wp14="http://schemas.microsoft.com/office/word/2010/wordprocessingDrawing" xmlns:wp="http://schemas.openxmlformats.org/drawingml/2006/wordprocessingDrawing" xmlns:w10="urn:schemas-microsoft-com:office:word" xmlns:w="http://schemas.openxmlformats.org/wordprocessingml/2006/main" xmlns:w14="http://schemas.microsoft.com/office/word/2010/wordml" xmlns:w15="http://schemas.microsoft.com/office/word/2012/wordml" xmlns:w16cex="http://schemas.microsoft.com/office/word/2018/wordml/cex" xmlns:w16cid="http://schemas.microsoft.com/office/word/2016/wordml/cid" xmlns:w16="http://schemas.microsoft.com/office/word/2018/wordml" xmlns:w16du="http://schemas.microsoft.com/office/word/2023/wordml/word16du" xmlns:w16sdtdh="http://schemas.microsoft.com/office/word/2020/wordml/sdtdatahash" xmlns:w16se="http://schemas.microsoft.com/office/word/2015/wordml/symex" xmlns:wpg="http://schemas.microsoft.com/office/word/2010/wordprocessingGroup" xmlns:wpi="http://schemas.microsoft.com/office/word/2010/wordprocessingInk" xmlns:wne="http://schemas.microsoft.com/office/word/2006/wordml" xmlns:wps="http://schemas.microsoft.com/office/word/2010/wordprocessingShape" mc:Ignorable="w14 w15 w16se w16cid w16 w16cex w16sdtdh w16du wp14">
+<w:hdr xmlns:wpc="http://schemas.microsoft.com/office/word/2010/wordprocessingCanvas" xmlns:cx="http://schemas.microsoft.com/office/drawing/2014/chartex" xmlns:cx1="http://schemas.microsoft.com/office/drawing/2015/9/8/chartex" xmlns:cx2="http://schemas.microsoft.com/office/drawing/2015/10/21/chartex" xmlns:cx3="http://schemas.microsoft.com/office/drawing/2016/5/9/chartex" xmlns:cx4="http://schemas.microsoft.com/office/drawing/2016/5/10/chartex" xmlns:cx5="http://schemas.microsoft.com/office/drawing/2016/5/11/chartex" xmlns:cx6="http://schemas.microsoft.com/office/drawing/2016/5/12/chartex" xmlns:cx7="http://schemas.microsoft.com/office/drawing/2016/5/13/chartex" xmlns:cx8="http://schemas.microsoft.com/office/drawing/2016/5/14/chartex" xmlns:mc="http://schemas.openxmlformats.org/markup-compatibility/2006" xmlns:aink="http://schemas.microsoft.com/office/drawing/2016/ink" xmlns:am3d="http://schemas.microsoft.com/office/drawing/2017/model3d" xmlns:o="urn:schemas-microsoft-com:office:office" xmlns:oel="http://schemas.microsoft.com/office/2019/extlst" xmlns:r="http://schemas.openxmlformats.org/officeDocument/2006/relationships" xmlns:m="http://schemas.openxmlformats.org/officeDocument/2006/math" xmlns:v="urn:schemas-microsoft-com:vml" xmlns:wp14="http://schemas.microsoft.com/office/word/2010/wordprocessingDrawing" xmlns:wp="http://schemas.openxmlformats.org/drawingml/2006/wordprocessingDrawing" xmlns:w10="urn:schemas-microsoft-com:office:word" xmlns:w="http://schemas.openxmlformats.org/wordprocessingml/2006/main" xmlns:w14="http://schemas.microsoft.com/office/word/2010/wordml" xmlns:w15="http://schemas.microsoft.com/office/word/2012/wordml" xmlns:w16cex="http://schemas.microsoft.com/office/word/2018/wordml/cex" xmlns:w16cid="http://schemas.microsoft.com/office/word/2016/wordml/cid" xmlns:w16="http://schemas.microsoft.com/office/word/2018/wordml" xmlns:w16du="http://schemas.microsoft.com/office/word/2023/wordml/word16du" xmlns:w16sdtdh="http://schemas.microsoft.com/office/word/2020/wordml/sdtdatahash" xmlns:w16sdtfl="http://schemas.microsoft.com/office/word/2024/wordml/sdtformatlock" xmlns:w16se="http://schemas.microsoft.com/office/word/2015/wordml/symex" xmlns:wpg="http://schemas.microsoft.com/office/word/2010/wordprocessingGroup" xmlns:wpi="http://schemas.microsoft.com/office/word/2010/wordprocessingInk" xmlns:wne="http://schemas.microsoft.com/office/word/2006/wordml" xmlns:wps="http://schemas.microsoft.com/office/word/2010/wordprocessingShape" mc:Ignorable="w14 w15 w16se w16cid w16 w16cex w16sdtdh w16sdtfl w16du wp14">
   <w:tbl>
     <w:tblPr>
       <w:tblW w:w="5000" w:type="pct"/>
@@ -6141,7 +6147,7 @@
 </file>
 
 <file path=word/numbering.xml><?xml version="1.0" encoding="utf-8"?>
-<w:numbering xmlns:wpc="http://schemas.microsoft.com/office/word/2010/wordprocessingCanvas" xmlns:cx="http://schemas.microsoft.com/office/drawing/2014/chartex" xmlns:cx1="http://schemas.microsoft.com/office/drawing/2015/9/8/chartex" xmlns:cx2="http://schemas.microsoft.com/office/drawing/2015/10/21/chartex" xmlns:cx3="http://schemas.microsoft.com/office/drawing/2016/5/9/chartex" xmlns:cx4="http://schemas.microsoft.com/office/drawing/2016/5/10/chartex" xmlns:cx5="http://schemas.microsoft.com/office/drawing/2016/5/11/chartex" xmlns:cx6="http://schemas.microsoft.com/office/drawing/2016/5/12/chartex" xmlns:cx7="http://schemas.microsoft.com/office/drawing/2016/5/13/chartex" xmlns:cx8="http://schemas.microsoft.com/office/drawing/2016/5/14/chartex" xmlns:mc="http://schemas.openxmlformats.org/markup-compatibility/2006" xmlns:aink="http://schemas.microsoft.com/office/drawing/2016/ink" xmlns:am3d="http://schemas.microsoft.com/office/drawing/2017/model3d" xmlns:o="urn:schemas-microsoft-com:office:office" xmlns:oel="http://schemas.microsoft.com/office/2019/extlst" xmlns:r="http://schemas.openxmlformats.org/officeDocument/2006/relationships" xmlns:m="http://schemas.openxmlformats.org/officeDocument/2006/math" xmlns:v="urn:schemas-microsoft-com:vml" xmlns:wp14="http://schemas.microsoft.com/office/word/2010/wordprocessingDrawing" xmlns:wp="http://schemas.openxmlformats.org/drawingml/2006/wordprocessingDrawing" xmlns:w10="urn:schemas-microsoft-com:office:word" xmlns:w="http://schemas.openxmlformats.org/wordprocessingml/2006/main" xmlns:w14="http://schemas.microsoft.com/office/word/2010/wordml" xmlns:w15="http://schemas.microsoft.com/office/word/2012/wordml" xmlns:w16cex="http://schemas.microsoft.com/office/word/2018/wordml/cex" xmlns:w16cid="http://schemas.microsoft.com/office/word/2016/wordml/cid" xmlns:w16="http://schemas.microsoft.com/office/word/2018/wordml" xmlns:w16du="http://schemas.microsoft.com/office/word/2023/wordml/word16du" xmlns:w16sdtdh="http://schemas.microsoft.com/office/word/2020/wordml/sdtdatahash" xmlns:w16se="http://schemas.microsoft.com/office/word/2015/wordml/symex" xmlns:wpg="http://schemas.microsoft.com/office/word/2010/wordprocessingGroup" xmlns:wpi="http://schemas.microsoft.com/office/word/2010/wordprocessingInk" xmlns:wne="http://schemas.microsoft.com/office/word/2006/wordml" xmlns:wps="http://schemas.microsoft.com/office/word/2010/wordprocessingShape" mc:Ignorable="w14 w15 w16se w16cid w16 w16cex w16sdtdh w16du wp14">
+<w:numbering xmlns:wpc="http://schemas.microsoft.com/office/word/2010/wordprocessingCanvas" xmlns:cx="http://schemas.microsoft.com/office/drawing/2014/chartex" xmlns:cx1="http://schemas.microsoft.com/office/drawing/2015/9/8/chartex" xmlns:cx2="http://schemas.microsoft.com/office/drawing/2015/10/21/chartex" xmlns:cx3="http://schemas.microsoft.com/office/drawing/2016/5/9/chartex" xmlns:cx4="http://schemas.microsoft.com/office/drawing/2016/5/10/chartex" xmlns:cx5="http://schemas.microsoft.com/office/drawing/2016/5/11/chartex" xmlns:cx6="http://schemas.microsoft.com/office/drawing/2016/5/12/chartex" xmlns:cx7="http://schemas.microsoft.com/office/drawing/2016/5/13/chartex" xmlns:cx8="http://schemas.microsoft.com/office/drawing/2016/5/14/chartex" xmlns:mc="http://schemas.openxmlformats.org/markup-compatibility/2006" xmlns:aink="http://schemas.microsoft.com/office/drawing/2016/ink" xmlns:am3d="http://schemas.microsoft.com/office/drawing/2017/model3d" xmlns:o="urn:schemas-microsoft-com:office:office" xmlns:oel="http://schemas.microsoft.com/office/2019/extlst" xmlns:r="http://schemas.openxmlformats.org/officeDocument/2006/relationships" xmlns:m="http://schemas.openxmlformats.org/officeDocument/2006/math" xmlns:v="urn:schemas-microsoft-com:vml" xmlns:wp14="http://schemas.microsoft.com/office/word/2010/wordprocessingDrawing" xmlns:wp="http://schemas.openxmlformats.org/drawingml/2006/wordprocessingDrawing" xmlns:w10="urn:schemas-microsoft-com:office:word" xmlns:w="http://schemas.openxmlformats.org/wordprocessingml/2006/main" xmlns:w14="http://schemas.microsoft.com/office/word/2010/wordml" xmlns:w15="http://schemas.microsoft.com/office/word/2012/wordml" xmlns:w16cex="http://schemas.microsoft.com/office/word/2018/wordml/cex" xmlns:w16cid="http://schemas.microsoft.com/office/word/2016/wordml/cid" xmlns:w16="http://schemas.microsoft.com/office/word/2018/wordml" xmlns:w16du="http://schemas.microsoft.com/office/word/2023/wordml/word16du" xmlns:w16sdtdh="http://schemas.microsoft.com/office/word/2020/wordml/sdtdatahash" xmlns:w16sdtfl="http://schemas.microsoft.com/office/word/2024/wordml/sdtformatlock" xmlns:w16se="http://schemas.microsoft.com/office/word/2015/wordml/symex" xmlns:wpg="http://schemas.microsoft.com/office/word/2010/wordprocessingGroup" xmlns:wpi="http://schemas.microsoft.com/office/word/2010/wordprocessingInk" xmlns:wne="http://schemas.microsoft.com/office/word/2006/wordml" xmlns:wps="http://schemas.microsoft.com/office/word/2010/wordprocessingShape" mc:Ignorable="w14 w15 w16se w16cid w16 w16cex w16sdtdh w16sdtfl w16du wp14">
   <w:abstractNum w:abstractNumId="0" w15:restartNumberingAfterBreak="0">
     <w:nsid w:val="00C37912"/>
     <w:multiLevelType w:val="multilevel"/>
@@ -11827,7 +11833,7 @@
 </file>
 
 <file path=word/styles.xml><?xml version="1.0" encoding="utf-8"?>
-<w:styles xmlns:mc="http://schemas.openxmlformats.org/markup-compatibility/2006" xmlns:r="http://schemas.openxmlformats.org/officeDocument/2006/relationships" xmlns:w="http://schemas.openxmlformats.org/wordprocessingml/2006/main" xmlns:w14="http://schemas.microsoft.com/office/word/2010/wordml" xmlns:w15="http://schemas.microsoft.com/office/word/2012/wordml" xmlns:w16cex="http://schemas.microsoft.com/office/word/2018/wordml/cex" xmlns:w16cid="http://schemas.microsoft.com/office/word/2016/wordml/cid" xmlns:w16="http://schemas.microsoft.com/office/word/2018/wordml" xmlns:w16du="http://schemas.microsoft.com/office/word/2023/wordml/word16du" xmlns:w16sdtdh="http://schemas.microsoft.com/office/word/2020/wordml/sdtdatahash" xmlns:w16se="http://schemas.microsoft.com/office/word/2015/wordml/symex" mc:Ignorable="w14 w15 w16se w16cid w16 w16cex w16sdtdh w16du">
+<w:styles xmlns:mc="http://schemas.openxmlformats.org/markup-compatibility/2006" xmlns:r="http://schemas.openxmlformats.org/officeDocument/2006/relationships" xmlns:w="http://schemas.openxmlformats.org/wordprocessingml/2006/main" xmlns:w14="http://schemas.microsoft.com/office/word/2010/wordml" xmlns:w15="http://schemas.microsoft.com/office/word/2012/wordml" xmlns:w16cex="http://schemas.microsoft.com/office/word/2018/wordml/cex" xmlns:w16cid="http://schemas.microsoft.com/office/word/2016/wordml/cid" xmlns:w16="http://schemas.microsoft.com/office/word/2018/wordml" xmlns:w16du="http://schemas.microsoft.com/office/word/2023/wordml/word16du" xmlns:w16sdtdh="http://schemas.microsoft.com/office/word/2020/wordml/sdtdatahash" xmlns:w16sdtfl="http://schemas.microsoft.com/office/word/2024/wordml/sdtformatlock" xmlns:w16se="http://schemas.microsoft.com/office/word/2015/wordml/symex" mc:Ignorable="w14 w15 w16se w16cid w16 w16cex w16sdtdh w16sdtfl w16du">
   <w:docDefaults>
     <w:rPrDefault>
       <w:rPr>
@@ -12848,6 +12854,10 @@
 </file>
 
 <file path=customXml/item1.xml><?xml version="1.0" encoding="utf-8"?>
+<b:Sources xmlns:b="http://schemas.openxmlformats.org/officeDocument/2006/bibliography" xmlns="http://schemas.openxmlformats.org/officeDocument/2006/bibliography" SelectedStyle="\APA.XSL" StyleName="APA"/>
+</file>
+
+<file path=customXml/item2.xml><?xml version="1.0" encoding="utf-8"?>
 <ct:contentTypeSchema xmlns:ct="http://schemas.microsoft.com/office/2006/metadata/contentType" xmlns:ma="http://schemas.microsoft.com/office/2006/metadata/properties/metaAttributes" ct:_="" ma:_="" ma:contentTypeName="Documento" ma:contentTypeID="0x010100108846D5F9C3AE4C85EBCC6E9567D38C" ma:contentTypeVersion="13" ma:contentTypeDescription="Crear nuevo documento." ma:contentTypeScope="" ma:versionID="234bf719b0d5b04b273866643ddfa94d">
   <xsd:schema xmlns:xsd="http://www.w3.org/2001/XMLSchema" xmlns:xs="http://www.w3.org/2001/XMLSchema" xmlns:p="http://schemas.microsoft.com/office/2006/metadata/properties" xmlns:ns2="15c23b83-0a74-4dd8-96fd-c1cdb1965e64" xmlns:ns3="a9d0ce2f-9ce2-4b22-8e2a-723aa410c551" targetNamespace="http://schemas.microsoft.com/office/2006/metadata/properties" ma:root="true" ma:fieldsID="4d848263e9339a884436c6a48d27beb6" ns2:_="" ns3:_="">
     <xsd:import namespace="15c23b83-0a74-4dd8-96fd-c1cdb1965e64"/>
@@ -13054,11 +13064,16 @@
 </ct:contentTypeSchema>
 </file>
 
-<file path=customXml/item2.xml><?xml version="1.0" encoding="utf-8"?>
-<b:Sources xmlns:b="http://schemas.openxmlformats.org/officeDocument/2006/bibliography" xmlns="http://schemas.openxmlformats.org/officeDocument/2006/bibliography" SelectedStyle="\APA.XSL" StyleName="APA"/>
+<file path=customXml/item3.xml><?xml version="1.0" encoding="utf-8"?>
+<?mso-contentType ?>
+<FormTemplates xmlns="http://schemas.microsoft.com/sharepoint/v3/contenttype/forms">
+  <Display>DocumentLibraryForm</Display>
+  <Edit>DocumentLibraryForm</Edit>
+  <New>DocumentLibraryForm</New>
+</FormTemplates>
 </file>
 
-<file path=customXml/item3.xml><?xml version="1.0" encoding="utf-8"?>
+<file path=customXml/item4.xml><?xml version="1.0" encoding="utf-8"?>
 <p:properties xmlns:p="http://schemas.microsoft.com/office/2006/metadata/properties" xmlns:xsi="http://www.w3.org/2001/XMLSchema-instance" xmlns:pc="http://schemas.microsoft.com/office/infopath/2007/PartnerControls">
   <documentManagement>
     <lcf76f155ced4ddcb4097134ff3c332f xmlns="15c23b83-0a74-4dd8-96fd-c1cdb1965e64">
@@ -13069,16 +13084,15 @@
 </p:properties>
 </file>
 
-<file path=customXml/item4.xml><?xml version="1.0" encoding="utf-8"?>
-<?mso-contentType ?>
-<FormTemplates xmlns="http://schemas.microsoft.com/sharepoint/v3/contenttype/forms">
-  <Display>DocumentLibraryForm</Display>
-  <Edit>DocumentLibraryForm</Edit>
-  <New>DocumentLibraryForm</New>
-</FormTemplates>
+<file path=customXml/itemProps1.xml><?xml version="1.0" encoding="utf-8"?>
+<ds:datastoreItem xmlns:ds="http://schemas.openxmlformats.org/officeDocument/2006/customXml" ds:itemID="{96A43DE0-C03F-45E5-9068-2EE0EA7CF44C}">
+  <ds:schemaRefs>
+    <ds:schemaRef ds:uri="http://schemas.openxmlformats.org/officeDocument/2006/bibliography"/>
+  </ds:schemaRefs>
+</ds:datastoreItem>
 </file>
 
-<file path=customXml/itemProps1.xml><?xml version="1.0" encoding="utf-8"?>
+<file path=customXml/itemProps2.xml><?xml version="1.0" encoding="utf-8"?>
 <ds:datastoreItem xmlns:ds="http://schemas.openxmlformats.org/officeDocument/2006/customXml" ds:itemID="{25D14615-32B3-4B0B-A050-130F1047B333}">
   <ds:schemaRefs>
     <ds:schemaRef ds:uri="http://schemas.microsoft.com/office/2006/metadata/contentType"/>
@@ -13097,15 +13111,15 @@
 </ds:datastoreItem>
 </file>
 
-<file path=customXml/itemProps2.xml><?xml version="1.0" encoding="utf-8"?>
-<ds:datastoreItem xmlns:ds="http://schemas.openxmlformats.org/officeDocument/2006/customXml" ds:itemID="{96A43DE0-C03F-45E5-9068-2EE0EA7CF44C}">
+<file path=customXml/itemProps3.xml><?xml version="1.0" encoding="utf-8"?>
+<ds:datastoreItem xmlns:ds="http://schemas.openxmlformats.org/officeDocument/2006/customXml" ds:itemID="{02DBB922-8161-4D11-894A-D3B4AD33821F}">
   <ds:schemaRefs>
-    <ds:schemaRef ds:uri="http://schemas.openxmlformats.org/officeDocument/2006/bibliography"/>
+    <ds:schemaRef ds:uri="http://schemas.microsoft.com/sharepoint/v3/contenttype/forms"/>
   </ds:schemaRefs>
 </ds:datastoreItem>
 </file>
 
-<file path=customXml/itemProps3.xml><?xml version="1.0" encoding="utf-8"?>
+<file path=customXml/itemProps4.xml><?xml version="1.0" encoding="utf-8"?>
 <ds:datastoreItem xmlns:ds="http://schemas.openxmlformats.org/officeDocument/2006/customXml" ds:itemID="{D33D0933-4E50-44B1-BF80-2C059485A8C7}">
   <ds:schemaRefs>
     <ds:schemaRef ds:uri="http://schemas.microsoft.com/office/2006/metadata/properties"/>
@@ -13114,12 +13128,4 @@
     <ds:schemaRef ds:uri="a9d0ce2f-9ce2-4b22-8e2a-723aa410c551"/>
   </ds:schemaRefs>
 </ds:datastoreItem>
-</file>
-
-<file path=customXml/itemProps4.xml><?xml version="1.0" encoding="utf-8"?>
-<ds:datastoreItem xmlns:ds="http://schemas.openxmlformats.org/officeDocument/2006/customXml" ds:itemID="{02DBB922-8161-4D11-894A-D3B4AD33821F}">
-  <ds:schemaRefs>
-    <ds:schemaRef ds:uri="http://schemas.microsoft.com/sharepoint/v3/contenttype/forms"/>
-  </ds:schemaRefs>
-</ds:datastoreItem>
 </file>
</xml_diff>

<commit_message>
Plan de formaci´øn con modificación del producto - ARTICULO DE DIVULGACION
</commit_message>
<xml_diff>
--- a/FGN106PlanDeFormacionJovenIinvestigador.docx
+++ b/FGN106PlanDeFormacionJovenIinvestigador.docx
@@ -3772,6 +3772,86 @@
                 <w:u w:val="single"/>
               </w:rPr>
             </w:pPr>
+            <w:r>
+              <w:rPr>
+                <w:rFonts w:ascii="Arial" w:hAnsi="Arial" w:cs="Arial"/>
+                <w:u w:val="single"/>
+              </w:rPr>
+              <w:t>Sometimiento de manuscrito en una revista de divulgación con ISSN</w:t>
+            </w:r>
+          </w:p>
+        </w:tc>
+        <w:tc>
+          <w:tcPr>
+            <w:tcW w:w="1240" w:type="dxa"/>
+            <w:vAlign w:val="center"/>
+          </w:tcPr>
+          <w:p>
+            <w:pPr>
+              <w:autoSpaceDE w:val="0"/>
+              <w:autoSpaceDN w:val="0"/>
+              <w:spacing w:line="276" w:lineRule="auto"/>
+              <w:ind w:left="0"/>
+              <w:jc w:val="center"/>
+              <w:rPr>
+                <w:rFonts w:ascii="Arial" w:hAnsi="Arial" w:cs="Arial"/>
+                <w:u w:val="single"/>
+              </w:rPr>
+            </w:pPr>
+            <w:r>
+              <w:rPr>
+                <w:rFonts w:ascii="Arial" w:hAnsi="Arial" w:cs="Arial"/>
+                <w:u w:val="single"/>
+              </w:rPr>
+              <w:t>1</w:t>
+            </w:r>
+          </w:p>
+        </w:tc>
+      </w:tr>
+      <w:tr>
+        <w:trPr>
+          <w:jc w:val="center"/>
+        </w:trPr>
+        <w:tc>
+          <w:tcPr>
+            <w:tcW w:w="3539" w:type="dxa"/>
+          </w:tcPr>
+          <w:p>
+            <w:pPr>
+              <w:autoSpaceDE w:val="0"/>
+              <w:autoSpaceDN w:val="0"/>
+              <w:spacing w:line="276" w:lineRule="auto"/>
+              <w:ind w:left="0"/>
+              <w:rPr>
+                <w:rFonts w:ascii="Arial" w:hAnsi="Arial" w:cs="Arial"/>
+                <w:bCs/>
+              </w:rPr>
+            </w:pPr>
+            <w:r>
+              <w:rPr>
+                <w:rFonts w:ascii="Arial" w:hAnsi="Arial" w:cs="Arial"/>
+                <w:bCs/>
+              </w:rPr>
+              <w:t>Desarrollo Tecnológico e Innovación</w:t>
+            </w:r>
+          </w:p>
+        </w:tc>
+        <w:tc>
+          <w:tcPr>
+            <w:tcW w:w="3436" w:type="dxa"/>
+          </w:tcPr>
+          <w:p>
+            <w:pPr>
+              <w:autoSpaceDE w:val="0"/>
+              <w:autoSpaceDN w:val="0"/>
+              <w:spacing w:line="276" w:lineRule="auto"/>
+              <w:ind w:left="0"/>
+              <w:jc w:val="left"/>
+              <w:rPr>
+                <w:rFonts w:ascii="Arial" w:hAnsi="Arial" w:cs="Arial"/>
+                <w:u w:val="single"/>
+              </w:rPr>
+            </w:pPr>
           </w:p>
         </w:tc>
         <w:tc>
@@ -3818,7 +3898,7 @@
                 <w:rFonts w:ascii="Arial" w:hAnsi="Arial" w:cs="Arial"/>
                 <w:bCs/>
               </w:rPr>
-              <w:t>Desarrollo Tecnológico e Innovación</w:t>
+              <w:t>Apropiación Social del Conocimiento y Divulgación Pública de la Ciencia</w:t>
             </w:r>
           </w:p>
         </w:tc>
@@ -3832,7 +3912,6 @@
               <w:autoSpaceDN w:val="0"/>
               <w:spacing w:line="276" w:lineRule="auto"/>
               <w:ind w:left="0"/>
-              <w:jc w:val="left"/>
               <w:rPr>
                 <w:rFonts w:ascii="Arial" w:hAnsi="Arial" w:cs="Arial"/>
                 <w:u w:val="single"/>
@@ -3857,85 +3936,6 @@
                 <w:u w:val="single"/>
               </w:rPr>
             </w:pPr>
-          </w:p>
-        </w:tc>
-      </w:tr>
-      <w:tr>
-        <w:trPr>
-          <w:jc w:val="center"/>
-        </w:trPr>
-        <w:tc>
-          <w:tcPr>
-            <w:tcW w:w="3539" w:type="dxa"/>
-          </w:tcPr>
-          <w:p>
-            <w:pPr>
-              <w:autoSpaceDE w:val="0"/>
-              <w:autoSpaceDN w:val="0"/>
-              <w:spacing w:line="276" w:lineRule="auto"/>
-              <w:ind w:left="0"/>
-              <w:rPr>
-                <w:rFonts w:ascii="Arial" w:hAnsi="Arial" w:cs="Arial"/>
-                <w:bCs/>
-              </w:rPr>
-            </w:pPr>
-            <w:r>
-              <w:rPr>
-                <w:rFonts w:ascii="Arial" w:hAnsi="Arial" w:cs="Arial"/>
-                <w:bCs/>
-              </w:rPr>
-              <w:t>Apropiación Social del Conocimiento y Divulgación Pública de la Ciencia</w:t>
-            </w:r>
-          </w:p>
-        </w:tc>
-        <w:tc>
-          <w:tcPr>
-            <w:tcW w:w="3436" w:type="dxa"/>
-          </w:tcPr>
-          <w:p>
-            <w:pPr>
-              <w:autoSpaceDE w:val="0"/>
-              <w:autoSpaceDN w:val="0"/>
-              <w:spacing w:line="276" w:lineRule="auto"/>
-              <w:ind w:left="0"/>
-              <w:rPr>
-                <w:rFonts w:ascii="Arial" w:hAnsi="Arial" w:cs="Arial"/>
-                <w:u w:val="single"/>
-              </w:rPr>
-            </w:pPr>
-            <w:r>
-              <w:rPr>
-                <w:rFonts w:ascii="Arial" w:hAnsi="Arial" w:cs="Arial"/>
-                <w:u w:val="single"/>
-              </w:rPr>
-              <w:t>Video de divulgación sobre plataformas HIL y su importancia en investigación</w:t>
-            </w:r>
-          </w:p>
-        </w:tc>
-        <w:tc>
-          <w:tcPr>
-            <w:tcW w:w="1240" w:type="dxa"/>
-            <w:vAlign w:val="center"/>
-          </w:tcPr>
-          <w:p>
-            <w:pPr>
-              <w:autoSpaceDE w:val="0"/>
-              <w:autoSpaceDN w:val="0"/>
-              <w:spacing w:line="276" w:lineRule="auto"/>
-              <w:ind w:left="0"/>
-              <w:jc w:val="center"/>
-              <w:rPr>
-                <w:rFonts w:ascii="Arial" w:hAnsi="Arial" w:cs="Arial"/>
-                <w:u w:val="single"/>
-              </w:rPr>
-            </w:pPr>
-            <w:r>
-              <w:rPr>
-                <w:rFonts w:ascii="Arial" w:hAnsi="Arial" w:cs="Arial"/>
-                <w:u w:val="single"/>
-              </w:rPr>
-              <w:t>1</w:t>
-            </w:r>
           </w:p>
         </w:tc>
       </w:tr>
@@ -4976,7 +4976,7 @@
           <w:lang w:val="es-CO"/>
         </w:rPr>
         <w:drawing>
-          <wp:inline distT="0" distB="0" distL="0" distR="0" wp14:anchorId="0D3B9CDD" wp14:editId="16D8430D">
+          <wp:inline distT="0" distB="0" distL="0" distR="0" wp14:anchorId="0D3B9CDD" wp14:editId="01717907">
             <wp:extent cx="1465918" cy="424069"/>
             <wp:effectExtent l="0" t="0" r="0" b="0"/>
             <wp:docPr id="1434579622" name="Imagen 1"/>
@@ -12858,6 +12858,26 @@
 </file>
 
 <file path=customXml/item2.xml><?xml version="1.0" encoding="utf-8"?>
+<p:properties xmlns:p="http://schemas.microsoft.com/office/2006/metadata/properties" xmlns:xsi="http://www.w3.org/2001/XMLSchema-instance" xmlns:pc="http://schemas.microsoft.com/office/infopath/2007/PartnerControls">
+  <documentManagement>
+    <lcf76f155ced4ddcb4097134ff3c332f xmlns="15c23b83-0a74-4dd8-96fd-c1cdb1965e64">
+      <Terms xmlns="http://schemas.microsoft.com/office/infopath/2007/PartnerControls"/>
+    </lcf76f155ced4ddcb4097134ff3c332f>
+    <TaxCatchAll xmlns="a9d0ce2f-9ce2-4b22-8e2a-723aa410c551" xsi:nil="true"/>
+  </documentManagement>
+</p:properties>
+</file>
+
+<file path=customXml/item3.xml><?xml version="1.0" encoding="utf-8"?>
+<?mso-contentType ?>
+<FormTemplates xmlns="http://schemas.microsoft.com/sharepoint/v3/contenttype/forms">
+  <Display>DocumentLibraryForm</Display>
+  <Edit>DocumentLibraryForm</Edit>
+  <New>DocumentLibraryForm</New>
+</FormTemplates>
+</file>
+
+<file path=customXml/item4.xml><?xml version="1.0" encoding="utf-8"?>
 <ct:contentTypeSchema xmlns:ct="http://schemas.microsoft.com/office/2006/metadata/contentType" xmlns:ma="http://schemas.microsoft.com/office/2006/metadata/properties/metaAttributes" ct:_="" ma:_="" ma:contentTypeName="Documento" ma:contentTypeID="0x010100108846D5F9C3AE4C85EBCC6E9567D38C" ma:contentTypeVersion="13" ma:contentTypeDescription="Crear nuevo documento." ma:contentTypeScope="" ma:versionID="234bf719b0d5b04b273866643ddfa94d">
   <xsd:schema xmlns:xsd="http://www.w3.org/2001/XMLSchema" xmlns:xs="http://www.w3.org/2001/XMLSchema" xmlns:p="http://schemas.microsoft.com/office/2006/metadata/properties" xmlns:ns2="15c23b83-0a74-4dd8-96fd-c1cdb1965e64" xmlns:ns3="a9d0ce2f-9ce2-4b22-8e2a-723aa410c551" targetNamespace="http://schemas.microsoft.com/office/2006/metadata/properties" ma:root="true" ma:fieldsID="4d848263e9339a884436c6a48d27beb6" ns2:_="" ns3:_="">
     <xsd:import namespace="15c23b83-0a74-4dd8-96fd-c1cdb1965e64"/>
@@ -13064,26 +13084,6 @@
 </ct:contentTypeSchema>
 </file>
 
-<file path=customXml/item3.xml><?xml version="1.0" encoding="utf-8"?>
-<?mso-contentType ?>
-<FormTemplates xmlns="http://schemas.microsoft.com/sharepoint/v3/contenttype/forms">
-  <Display>DocumentLibraryForm</Display>
-  <Edit>DocumentLibraryForm</Edit>
-  <New>DocumentLibraryForm</New>
-</FormTemplates>
-</file>
-
-<file path=customXml/item4.xml><?xml version="1.0" encoding="utf-8"?>
-<p:properties xmlns:p="http://schemas.microsoft.com/office/2006/metadata/properties" xmlns:xsi="http://www.w3.org/2001/XMLSchema-instance" xmlns:pc="http://schemas.microsoft.com/office/infopath/2007/PartnerControls">
-  <documentManagement>
-    <lcf76f155ced4ddcb4097134ff3c332f xmlns="15c23b83-0a74-4dd8-96fd-c1cdb1965e64">
-      <Terms xmlns="http://schemas.microsoft.com/office/infopath/2007/PartnerControls"/>
-    </lcf76f155ced4ddcb4097134ff3c332f>
-    <TaxCatchAll xmlns="a9d0ce2f-9ce2-4b22-8e2a-723aa410c551" xsi:nil="true"/>
-  </documentManagement>
-</p:properties>
-</file>
-
 <file path=customXml/itemProps1.xml><?xml version="1.0" encoding="utf-8"?>
 <ds:datastoreItem xmlns:ds="http://schemas.openxmlformats.org/officeDocument/2006/customXml" ds:itemID="{96A43DE0-C03F-45E5-9068-2EE0EA7CF44C}">
   <ds:schemaRefs>
@@ -13093,6 +13093,25 @@
 </file>
 
 <file path=customXml/itemProps2.xml><?xml version="1.0" encoding="utf-8"?>
+<ds:datastoreItem xmlns:ds="http://schemas.openxmlformats.org/officeDocument/2006/customXml" ds:itemID="{D33D0933-4E50-44B1-BF80-2C059485A8C7}">
+  <ds:schemaRefs>
+    <ds:schemaRef ds:uri="http://schemas.microsoft.com/office/2006/metadata/properties"/>
+    <ds:schemaRef ds:uri="http://schemas.microsoft.com/office/infopath/2007/PartnerControls"/>
+    <ds:schemaRef ds:uri="15c23b83-0a74-4dd8-96fd-c1cdb1965e64"/>
+    <ds:schemaRef ds:uri="a9d0ce2f-9ce2-4b22-8e2a-723aa410c551"/>
+  </ds:schemaRefs>
+</ds:datastoreItem>
+</file>
+
+<file path=customXml/itemProps3.xml><?xml version="1.0" encoding="utf-8"?>
+<ds:datastoreItem xmlns:ds="http://schemas.openxmlformats.org/officeDocument/2006/customXml" ds:itemID="{02DBB922-8161-4D11-894A-D3B4AD33821F}">
+  <ds:schemaRefs>
+    <ds:schemaRef ds:uri="http://schemas.microsoft.com/sharepoint/v3/contenttype/forms"/>
+  </ds:schemaRefs>
+</ds:datastoreItem>
+</file>
+
+<file path=customXml/itemProps4.xml><?xml version="1.0" encoding="utf-8"?>
 <ds:datastoreItem xmlns:ds="http://schemas.openxmlformats.org/officeDocument/2006/customXml" ds:itemID="{25D14615-32B3-4B0B-A050-130F1047B333}">
   <ds:schemaRefs>
     <ds:schemaRef ds:uri="http://schemas.microsoft.com/office/2006/metadata/contentType"/>
@@ -13109,23 +13128,4 @@
     <ds:schemaRef ds:uri="http://schemas.microsoft.com/internal/obd"/>
   </ds:schemaRefs>
 </ds:datastoreItem>
-</file>
-
-<file path=customXml/itemProps3.xml><?xml version="1.0" encoding="utf-8"?>
-<ds:datastoreItem xmlns:ds="http://schemas.openxmlformats.org/officeDocument/2006/customXml" ds:itemID="{02DBB922-8161-4D11-894A-D3B4AD33821F}">
-  <ds:schemaRefs>
-    <ds:schemaRef ds:uri="http://schemas.microsoft.com/sharepoint/v3/contenttype/forms"/>
-  </ds:schemaRefs>
-</ds:datastoreItem>
-</file>
-
-<file path=customXml/itemProps4.xml><?xml version="1.0" encoding="utf-8"?>
-<ds:datastoreItem xmlns:ds="http://schemas.openxmlformats.org/officeDocument/2006/customXml" ds:itemID="{D33D0933-4E50-44B1-BF80-2C059485A8C7}">
-  <ds:schemaRefs>
-    <ds:schemaRef ds:uri="http://schemas.microsoft.com/office/2006/metadata/properties"/>
-    <ds:schemaRef ds:uri="http://schemas.microsoft.com/office/infopath/2007/PartnerControls"/>
-    <ds:schemaRef ds:uri="15c23b83-0a74-4dd8-96fd-c1cdb1965e64"/>
-    <ds:schemaRef ds:uri="a9d0ce2f-9ce2-4b22-8e2a-723aa410c551"/>
-  </ds:schemaRefs>
-</ds:datastoreItem>
 </file>
</xml_diff>